<commit_message>
docs: refresh report docx + animation with current architecture and results
- build_report.py narrative updated to Dueling + safety mask, 300 episodes
- regenerated docx: tables now show ties-best makespan / 0.0% miss / #1 balance
- architecture_animation.html: dueling streams, 300 episodes, current claims
</commit_message>
<xml_diff>
--- a/RL_MOTS_XAI_v2_Project_Report.docx
+++ b/RL_MOTS_XAI_v2_Project_Report.docx
@@ -260,7 +260,7 @@
           <w:color w:val="222222"/>
           <w:sz w:val="21"/>
         </w:rPr>
-        <w:t>A 3-layer MLP (45→128→64→32→8) in pure NumPy with manual backprop + Adam. Double DQN separates action selection from evaluation to reduce Q-overestimation. Outputs 8 Q-values (one per VM); argmax = chosen VM.</w:t>
+        <w:t>A Dueling architecture in pure NumPy with manual backprop + Adam: a shared backbone (45→128→64) splits into a value stream (→32→1) and an advantage stream (→32→8), combined as Q = V + (A − Ā). A state-derived safety mask excludes VMs above 90% utilization before the argmax. Double DQN separates action selection from evaluation to reduce Q-overestimation. Outputs 8 Q-values (one per VM); argmax = chosen VM.</w:t>
       </w:r>
     </w:p>
     <w:p>
@@ -286,7 +286,7 @@
           <w:color w:val="222222"/>
           <w:sz w:val="21"/>
         </w:rPr>
-        <w:t>50K-capacity SumTree buffer with Prioritized Experience Replay (high-TD-error transitions sampled more often). Soft Polyak target updates (τ=0.005) for stable learning. 150 episodes with curriculum-based task batching.</w:t>
+        <w:t>50K-capacity SumTree buffer with Prioritized Experience Replay (high-TD-error transitions sampled more often). Soft Polyak target updates (τ=0.005) for stable learning. 300 episodes with curriculum-based task batching.</w:t>
       </w:r>
     </w:p>
     <w:p>
@@ -554,7 +554,165 @@
         <w:tc>
           <w:tcPr>
             <w:tcW w:type="dxa" w:w="1984"/>
-            <w:shd w:fill="FFFFFF"/>
+            <w:shd w:fill="E8F7EE"/>
+            <w:tcMar>
+              <w:top w:w="80" w:type="dxa"/>
+              <w:bottom w:w="80" w:type="dxa"/>
+              <w:left w:w="120" w:type="dxa"/>
+              <w:right w:w="120" w:type="dxa"/>
+            </w:tcMar>
+          </w:tcPr>
+          <w:p>
+            <w:pPr>
+              <w:jc w:val="center"/>
+            </w:pPr>
+            <w:r>
+              <w:rPr>
+                <w:rFonts w:ascii="Calibri" w:hAnsi="Calibri"/>
+                <w:b/>
+                <w:color w:val="2D9B6B"/>
+                <w:sz w:val="19"/>
+              </w:rPr>
+              <w:t>DQN (ours) ★</w:t>
+            </w:r>
+          </w:p>
+        </w:tc>
+        <w:tc>
+          <w:tcPr>
+            <w:tcW w:type="dxa" w:w="1417"/>
+            <w:shd w:fill="E8F7EE"/>
+            <w:tcMar>
+              <w:top w:w="80" w:type="dxa"/>
+              <w:bottom w:w="80" w:type="dxa"/>
+              <w:left w:w="120" w:type="dxa"/>
+              <w:right w:w="120" w:type="dxa"/>
+            </w:tcMar>
+          </w:tcPr>
+          <w:p>
+            <w:pPr>
+              <w:jc w:val="center"/>
+            </w:pPr>
+            <w:r>
+              <w:rPr>
+                <w:rFonts w:ascii="Calibri" w:hAnsi="Calibri"/>
+                <w:b/>
+                <w:color w:val="2D9B6B"/>
+                <w:sz w:val="19"/>
+              </w:rPr>
+              <w:t>1194</w:t>
+            </w:r>
+          </w:p>
+        </w:tc>
+        <w:tc>
+          <w:tcPr>
+            <w:tcW w:type="dxa" w:w="1247"/>
+            <w:shd w:fill="E8F7EE"/>
+            <w:tcMar>
+              <w:top w:w="80" w:type="dxa"/>
+              <w:bottom w:w="80" w:type="dxa"/>
+              <w:left w:w="120" w:type="dxa"/>
+              <w:right w:w="120" w:type="dxa"/>
+            </w:tcMar>
+          </w:tcPr>
+          <w:p>
+            <w:pPr>
+              <w:jc w:val="center"/>
+            </w:pPr>
+            <w:r>
+              <w:rPr>
+                <w:rFonts w:ascii="Calibri" w:hAnsi="Calibri"/>
+                <w:b/>
+                <w:color w:val="2D9B6B"/>
+                <w:sz w:val="19"/>
+              </w:rPr>
+              <w:t>28971</w:t>
+            </w:r>
+          </w:p>
+        </w:tc>
+        <w:tc>
+          <w:tcPr>
+            <w:tcW w:type="dxa" w:w="1247"/>
+            <w:shd w:fill="E8F7EE"/>
+            <w:tcMar>
+              <w:top w:w="80" w:type="dxa"/>
+              <w:bottom w:w="80" w:type="dxa"/>
+              <w:left w:w="120" w:type="dxa"/>
+              <w:right w:w="120" w:type="dxa"/>
+            </w:tcMar>
+          </w:tcPr>
+          <w:p>
+            <w:pPr>
+              <w:jc w:val="center"/>
+            </w:pPr>
+            <w:r>
+              <w:rPr>
+                <w:rFonts w:ascii="Calibri" w:hAnsi="Calibri"/>
+                <w:b/>
+                <w:color w:val="2D9B6B"/>
+                <w:sz w:val="19"/>
+              </w:rPr>
+              <w:t>4173</w:t>
+            </w:r>
+          </w:p>
+        </w:tc>
+        <w:tc>
+          <w:tcPr>
+            <w:tcW w:type="dxa" w:w="1134"/>
+            <w:shd w:fill="E8F7EE"/>
+            <w:tcMar>
+              <w:top w:w="80" w:type="dxa"/>
+              <w:bottom w:w="80" w:type="dxa"/>
+              <w:left w:w="120" w:type="dxa"/>
+              <w:right w:w="120" w:type="dxa"/>
+            </w:tcMar>
+          </w:tcPr>
+          <w:p>
+            <w:pPr>
+              <w:jc w:val="center"/>
+            </w:pPr>
+            <w:r>
+              <w:rPr>
+                <w:rFonts w:ascii="Calibri" w:hAnsi="Calibri"/>
+                <w:b/>
+                <w:color w:val="2D9B6B"/>
+                <w:sz w:val="19"/>
+              </w:rPr>
+              <w:t>0.0%</w:t>
+            </w:r>
+          </w:p>
+        </w:tc>
+        <w:tc>
+          <w:tcPr>
+            <w:tcW w:type="dxa" w:w="1417"/>
+            <w:shd w:fill="E8F7EE"/>
+            <w:tcMar>
+              <w:top w:w="80" w:type="dxa"/>
+              <w:bottom w:w="80" w:type="dxa"/>
+              <w:left w:w="120" w:type="dxa"/>
+              <w:right w:w="120" w:type="dxa"/>
+            </w:tcMar>
+          </w:tcPr>
+          <w:p>
+            <w:pPr>
+              <w:jc w:val="center"/>
+            </w:pPr>
+            <w:r>
+              <w:rPr>
+                <w:rFonts w:ascii="Calibri" w:hAnsi="Calibri"/>
+                <w:b/>
+                <w:color w:val="2D9B6B"/>
+                <w:sz w:val="19"/>
+              </w:rPr>
+              <w:t>1.04</w:t>
+            </w:r>
+          </w:p>
+        </w:tc>
+      </w:tr>
+      <w:tr>
+        <w:tc>
+          <w:tcPr>
+            <w:tcW w:type="dxa" w:w="1984"/>
+            <w:shd w:fill="F4F6F9"/>
             <w:tcMar>
               <w:top w:w="80" w:type="dxa"/>
               <w:bottom w:w="80" w:type="dxa"/>
@@ -578,7 +736,7 @@
         <w:tc>
           <w:tcPr>
             <w:tcW w:type="dxa" w:w="1417"/>
-            <w:shd w:fill="FFFFFF"/>
+            <w:shd w:fill="F4F6F9"/>
             <w:tcMar>
               <w:top w:w="80" w:type="dxa"/>
               <w:bottom w:w="80" w:type="dxa"/>
@@ -602,7 +760,7 @@
         <w:tc>
           <w:tcPr>
             <w:tcW w:type="dxa" w:w="1247"/>
-            <w:shd w:fill="FFFFFF"/>
+            <w:shd w:fill="F4F6F9"/>
             <w:tcMar>
               <w:top w:w="80" w:type="dxa"/>
               <w:bottom w:w="80" w:type="dxa"/>
@@ -626,7 +784,7 @@
         <w:tc>
           <w:tcPr>
             <w:tcW w:type="dxa" w:w="1247"/>
-            <w:shd w:fill="FFFFFF"/>
+            <w:shd w:fill="F4F6F9"/>
             <w:tcMar>
               <w:top w:w="80" w:type="dxa"/>
               <w:bottom w:w="80" w:type="dxa"/>
@@ -650,7 +808,7 @@
         <w:tc>
           <w:tcPr>
             <w:tcW w:type="dxa" w:w="1134"/>
-            <w:shd w:fill="FFFFFF"/>
+            <w:shd w:fill="F4F6F9"/>
             <w:tcMar>
               <w:top w:w="80" w:type="dxa"/>
               <w:bottom w:w="80" w:type="dxa"/>
@@ -674,7 +832,7 @@
         <w:tc>
           <w:tcPr>
             <w:tcW w:type="dxa" w:w="1417"/>
-            <w:shd w:fill="FFFFFF"/>
+            <w:shd w:fill="F4F6F9"/>
             <w:tcMar>
               <w:top w:w="80" w:type="dxa"/>
               <w:bottom w:w="80" w:type="dxa"/>
@@ -700,7 +858,7 @@
         <w:tc>
           <w:tcPr>
             <w:tcW w:type="dxa" w:w="1984"/>
-            <w:shd w:fill="F4F6F9"/>
+            <w:shd w:fill="FFFFFF"/>
             <w:tcMar>
               <w:top w:w="80" w:type="dxa"/>
               <w:bottom w:w="80" w:type="dxa"/>
@@ -724,7 +882,7 @@
         <w:tc>
           <w:tcPr>
             <w:tcW w:type="dxa" w:w="1417"/>
-            <w:shd w:fill="F4F6F9"/>
+            <w:shd w:fill="FFFFFF"/>
             <w:tcMar>
               <w:top w:w="80" w:type="dxa"/>
               <w:bottom w:w="80" w:type="dxa"/>
@@ -748,7 +906,7 @@
         <w:tc>
           <w:tcPr>
             <w:tcW w:type="dxa" w:w="1247"/>
-            <w:shd w:fill="F4F6F9"/>
+            <w:shd w:fill="FFFFFF"/>
             <w:tcMar>
               <w:top w:w="80" w:type="dxa"/>
               <w:bottom w:w="80" w:type="dxa"/>
@@ -772,7 +930,7 @@
         <w:tc>
           <w:tcPr>
             <w:tcW w:type="dxa" w:w="1247"/>
-            <w:shd w:fill="F4F6F9"/>
+            <w:shd w:fill="FFFFFF"/>
             <w:tcMar>
               <w:top w:w="80" w:type="dxa"/>
               <w:bottom w:w="80" w:type="dxa"/>
@@ -796,7 +954,7 @@
         <w:tc>
           <w:tcPr>
             <w:tcW w:type="dxa" w:w="1134"/>
-            <w:shd w:fill="F4F6F9"/>
+            <w:shd w:fill="FFFFFF"/>
             <w:tcMar>
               <w:top w:w="80" w:type="dxa"/>
               <w:bottom w:w="80" w:type="dxa"/>
@@ -820,7 +978,7 @@
         <w:tc>
           <w:tcPr>
             <w:tcW w:type="dxa" w:w="1417"/>
-            <w:shd w:fill="F4F6F9"/>
+            <w:shd w:fill="FFFFFF"/>
             <w:tcMar>
               <w:top w:w="80" w:type="dxa"/>
               <w:bottom w:w="80" w:type="dxa"/>
@@ -846,6 +1004,152 @@
         <w:tc>
           <w:tcPr>
             <w:tcW w:type="dxa" w:w="1984"/>
+            <w:shd w:fill="F4F6F9"/>
+            <w:tcMar>
+              <w:top w:w="80" w:type="dxa"/>
+              <w:bottom w:w="80" w:type="dxa"/>
+              <w:left w:w="120" w:type="dxa"/>
+              <w:right w:w="120" w:type="dxa"/>
+            </w:tcMar>
+          </w:tcPr>
+          <w:p>
+            <w:pPr>
+              <w:jc w:val="center"/>
+            </w:pPr>
+            <w:r>
+              <w:rPr>
+                <w:rFonts w:ascii="Calibri" w:hAnsi="Calibri"/>
+                <w:sz w:val="19"/>
+              </w:rPr>
+              <w:t>FCFS</w:t>
+            </w:r>
+          </w:p>
+        </w:tc>
+        <w:tc>
+          <w:tcPr>
+            <w:tcW w:type="dxa" w:w="1417"/>
+            <w:shd w:fill="F4F6F9"/>
+            <w:tcMar>
+              <w:top w:w="80" w:type="dxa"/>
+              <w:bottom w:w="80" w:type="dxa"/>
+              <w:left w:w="120" w:type="dxa"/>
+              <w:right w:w="120" w:type="dxa"/>
+            </w:tcMar>
+          </w:tcPr>
+          <w:p>
+            <w:pPr>
+              <w:jc w:val="center"/>
+            </w:pPr>
+            <w:r>
+              <w:rPr>
+                <w:rFonts w:ascii="Calibri" w:hAnsi="Calibri"/>
+                <w:sz w:val="19"/>
+              </w:rPr>
+              <w:t>1633</w:t>
+            </w:r>
+          </w:p>
+        </w:tc>
+        <w:tc>
+          <w:tcPr>
+            <w:tcW w:type="dxa" w:w="1247"/>
+            <w:shd w:fill="F4F6F9"/>
+            <w:tcMar>
+              <w:top w:w="80" w:type="dxa"/>
+              <w:bottom w:w="80" w:type="dxa"/>
+              <w:left w:w="120" w:type="dxa"/>
+              <w:right w:w="120" w:type="dxa"/>
+            </w:tcMar>
+          </w:tcPr>
+          <w:p>
+            <w:pPr>
+              <w:jc w:val="center"/>
+            </w:pPr>
+            <w:r>
+              <w:rPr>
+                <w:rFonts w:ascii="Calibri" w:hAnsi="Calibri"/>
+                <w:sz w:val="19"/>
+              </w:rPr>
+              <w:t>39149</w:t>
+            </w:r>
+          </w:p>
+        </w:tc>
+        <w:tc>
+          <w:tcPr>
+            <w:tcW w:type="dxa" w:w="1247"/>
+            <w:shd w:fill="F4F6F9"/>
+            <w:tcMar>
+              <w:top w:w="80" w:type="dxa"/>
+              <w:bottom w:w="80" w:type="dxa"/>
+              <w:left w:w="120" w:type="dxa"/>
+              <w:right w:w="120" w:type="dxa"/>
+            </w:tcMar>
+          </w:tcPr>
+          <w:p>
+            <w:pPr>
+              <w:jc w:val="center"/>
+            </w:pPr>
+            <w:r>
+              <w:rPr>
+                <w:rFonts w:ascii="Calibri" w:hAnsi="Calibri"/>
+                <w:sz w:val="19"/>
+              </w:rPr>
+              <w:t>4122</w:t>
+            </w:r>
+          </w:p>
+        </w:tc>
+        <w:tc>
+          <w:tcPr>
+            <w:tcW w:type="dxa" w:w="1134"/>
+            <w:shd w:fill="F4F6F9"/>
+            <w:tcMar>
+              <w:top w:w="80" w:type="dxa"/>
+              <w:bottom w:w="80" w:type="dxa"/>
+              <w:left w:w="120" w:type="dxa"/>
+              <w:right w:w="120" w:type="dxa"/>
+            </w:tcMar>
+          </w:tcPr>
+          <w:p>
+            <w:pPr>
+              <w:jc w:val="center"/>
+            </w:pPr>
+            <w:r>
+              <w:rPr>
+                <w:rFonts w:ascii="Calibri" w:hAnsi="Calibri"/>
+                <w:sz w:val="19"/>
+              </w:rPr>
+              <w:t>4.6%</w:t>
+            </w:r>
+          </w:p>
+        </w:tc>
+        <w:tc>
+          <w:tcPr>
+            <w:tcW w:type="dxa" w:w="1417"/>
+            <w:shd w:fill="F4F6F9"/>
+            <w:tcMar>
+              <w:top w:w="80" w:type="dxa"/>
+              <w:bottom w:w="80" w:type="dxa"/>
+              <w:left w:w="120" w:type="dxa"/>
+              <w:right w:w="120" w:type="dxa"/>
+            </w:tcMar>
+          </w:tcPr>
+          <w:p>
+            <w:pPr>
+              <w:jc w:val="center"/>
+            </w:pPr>
+            <w:r>
+              <w:rPr>
+                <w:rFonts w:ascii="Calibri" w:hAnsi="Calibri"/>
+                <w:sz w:val="19"/>
+              </w:rPr>
+              <w:t>6.04</w:t>
+            </w:r>
+          </w:p>
+        </w:tc>
+      </w:tr>
+      <w:tr>
+        <w:tc>
+          <w:tcPr>
+            <w:tcW w:type="dxa" w:w="1984"/>
             <w:shd w:fill="FFFFFF"/>
             <w:tcMar>
               <w:top w:w="80" w:type="dxa"/>
@@ -863,7 +1167,7 @@
                 <w:rFonts w:ascii="Calibri" w:hAnsi="Calibri"/>
                 <w:sz w:val="19"/>
               </w:rPr>
-              <w:t>FCFS</w:t>
+              <w:t>RoundRobin</w:t>
             </w:r>
           </w:p>
         </w:tc>
@@ -1009,7 +1313,7 @@
                 <w:rFonts w:ascii="Calibri" w:hAnsi="Calibri"/>
                 <w:sz w:val="19"/>
               </w:rPr>
-              <w:t>RoundRobin</w:t>
+              <w:t>GreedyLeastLoaded</w:t>
             </w:r>
           </w:p>
         </w:tc>
@@ -1033,7 +1337,7 @@
                 <w:rFonts w:ascii="Calibri" w:hAnsi="Calibri"/>
                 <w:sz w:val="19"/>
               </w:rPr>
-              <w:t>1633</w:t>
+              <w:t>1257</w:t>
             </w:r>
           </w:p>
         </w:tc>
@@ -1057,7 +1361,7 @@
                 <w:rFonts w:ascii="Calibri" w:hAnsi="Calibri"/>
                 <w:sz w:val="19"/>
               </w:rPr>
-              <w:t>39149</w:t>
+              <w:t>41725</w:t>
             </w:r>
           </w:p>
         </w:tc>
@@ -1081,7 +1385,7 @@
                 <w:rFonts w:ascii="Calibri" w:hAnsi="Calibri"/>
                 <w:sz w:val="19"/>
               </w:rPr>
-              <w:t>4122</w:t>
+              <w:t>4466</w:t>
             </w:r>
           </w:p>
         </w:tc>
@@ -1105,7 +1409,7 @@
                 <w:rFonts w:ascii="Calibri" w:hAnsi="Calibri"/>
                 <w:sz w:val="19"/>
               </w:rPr>
-              <w:t>4.6%</w:t>
+              <w:t>0.1%</w:t>
             </w:r>
           </w:p>
         </w:tc>
@@ -1129,299 +1433,7 @@
                 <w:rFonts w:ascii="Calibri" w:hAnsi="Calibri"/>
                 <w:sz w:val="19"/>
               </w:rPr>
-              <w:t>6.04</w:t>
-            </w:r>
-          </w:p>
-        </w:tc>
-      </w:tr>
-      <w:tr>
-        <w:tc>
-          <w:tcPr>
-            <w:tcW w:type="dxa" w:w="1984"/>
-            <w:shd w:fill="FFFFFF"/>
-            <w:tcMar>
-              <w:top w:w="80" w:type="dxa"/>
-              <w:bottom w:w="80" w:type="dxa"/>
-              <w:left w:w="120" w:type="dxa"/>
-              <w:right w:w="120" w:type="dxa"/>
-            </w:tcMar>
-          </w:tcPr>
-          <w:p>
-            <w:pPr>
-              <w:jc w:val="center"/>
-            </w:pPr>
-            <w:r>
-              <w:rPr>
-                <w:rFonts w:ascii="Calibri" w:hAnsi="Calibri"/>
-                <w:sz w:val="19"/>
-              </w:rPr>
-              <w:t>GreedyLeastLoaded</w:t>
-            </w:r>
-          </w:p>
-        </w:tc>
-        <w:tc>
-          <w:tcPr>
-            <w:tcW w:type="dxa" w:w="1417"/>
-            <w:shd w:fill="FFFFFF"/>
-            <w:tcMar>
-              <w:top w:w="80" w:type="dxa"/>
-              <w:bottom w:w="80" w:type="dxa"/>
-              <w:left w:w="120" w:type="dxa"/>
-              <w:right w:w="120" w:type="dxa"/>
-            </w:tcMar>
-          </w:tcPr>
-          <w:p>
-            <w:pPr>
-              <w:jc w:val="center"/>
-            </w:pPr>
-            <w:r>
-              <w:rPr>
-                <w:rFonts w:ascii="Calibri" w:hAnsi="Calibri"/>
-                <w:sz w:val="19"/>
-              </w:rPr>
-              <w:t>1257</w:t>
-            </w:r>
-          </w:p>
-        </w:tc>
-        <w:tc>
-          <w:tcPr>
-            <w:tcW w:type="dxa" w:w="1247"/>
-            <w:shd w:fill="FFFFFF"/>
-            <w:tcMar>
-              <w:top w:w="80" w:type="dxa"/>
-              <w:bottom w:w="80" w:type="dxa"/>
-              <w:left w:w="120" w:type="dxa"/>
-              <w:right w:w="120" w:type="dxa"/>
-            </w:tcMar>
-          </w:tcPr>
-          <w:p>
-            <w:pPr>
-              <w:jc w:val="center"/>
-            </w:pPr>
-            <w:r>
-              <w:rPr>
-                <w:rFonts w:ascii="Calibri" w:hAnsi="Calibri"/>
-                <w:sz w:val="19"/>
-              </w:rPr>
-              <w:t>41725</w:t>
-            </w:r>
-          </w:p>
-        </w:tc>
-        <w:tc>
-          <w:tcPr>
-            <w:tcW w:type="dxa" w:w="1247"/>
-            <w:shd w:fill="FFFFFF"/>
-            <w:tcMar>
-              <w:top w:w="80" w:type="dxa"/>
-              <w:bottom w:w="80" w:type="dxa"/>
-              <w:left w:w="120" w:type="dxa"/>
-              <w:right w:w="120" w:type="dxa"/>
-            </w:tcMar>
-          </w:tcPr>
-          <w:p>
-            <w:pPr>
-              <w:jc w:val="center"/>
-            </w:pPr>
-            <w:r>
-              <w:rPr>
-                <w:rFonts w:ascii="Calibri" w:hAnsi="Calibri"/>
-                <w:sz w:val="19"/>
-              </w:rPr>
-              <w:t>4466</w:t>
-            </w:r>
-          </w:p>
-        </w:tc>
-        <w:tc>
-          <w:tcPr>
-            <w:tcW w:type="dxa" w:w="1134"/>
-            <w:shd w:fill="FFFFFF"/>
-            <w:tcMar>
-              <w:top w:w="80" w:type="dxa"/>
-              <w:bottom w:w="80" w:type="dxa"/>
-              <w:left w:w="120" w:type="dxa"/>
-              <w:right w:w="120" w:type="dxa"/>
-            </w:tcMar>
-          </w:tcPr>
-          <w:p>
-            <w:pPr>
-              <w:jc w:val="center"/>
-            </w:pPr>
-            <w:r>
-              <w:rPr>
-                <w:rFonts w:ascii="Calibri" w:hAnsi="Calibri"/>
-                <w:sz w:val="19"/>
-              </w:rPr>
-              <w:t>0.1%</w:t>
-            </w:r>
-          </w:p>
-        </w:tc>
-        <w:tc>
-          <w:tcPr>
-            <w:tcW w:type="dxa" w:w="1417"/>
-            <w:shd w:fill="FFFFFF"/>
-            <w:tcMar>
-              <w:top w:w="80" w:type="dxa"/>
-              <w:bottom w:w="80" w:type="dxa"/>
-              <w:left w:w="120" w:type="dxa"/>
-              <w:right w:w="120" w:type="dxa"/>
-            </w:tcMar>
-          </w:tcPr>
-          <w:p>
-            <w:pPr>
-              <w:jc w:val="center"/>
-            </w:pPr>
-            <w:r>
-              <w:rPr>
-                <w:rFonts w:ascii="Calibri" w:hAnsi="Calibri"/>
-                <w:sz w:val="19"/>
-              </w:rPr>
               <w:t>2.88</w:t>
-            </w:r>
-          </w:p>
-        </w:tc>
-      </w:tr>
-      <w:tr>
-        <w:tc>
-          <w:tcPr>
-            <w:tcW w:type="dxa" w:w="1984"/>
-            <w:shd w:fill="F4F6F9"/>
-            <w:tcMar>
-              <w:top w:w="80" w:type="dxa"/>
-              <w:bottom w:w="80" w:type="dxa"/>
-              <w:left w:w="120" w:type="dxa"/>
-              <w:right w:w="120" w:type="dxa"/>
-            </w:tcMar>
-          </w:tcPr>
-          <w:p>
-            <w:pPr>
-              <w:jc w:val="center"/>
-            </w:pPr>
-            <w:r>
-              <w:rPr>
-                <w:rFonts w:ascii="Calibri" w:hAnsi="Calibri"/>
-                <w:sz w:val="19"/>
-              </w:rPr>
-              <w:t>Q-learning</w:t>
-            </w:r>
-          </w:p>
-        </w:tc>
-        <w:tc>
-          <w:tcPr>
-            <w:tcW w:type="dxa" w:w="1417"/>
-            <w:shd w:fill="F4F6F9"/>
-            <w:tcMar>
-              <w:top w:w="80" w:type="dxa"/>
-              <w:bottom w:w="80" w:type="dxa"/>
-              <w:left w:w="120" w:type="dxa"/>
-              <w:right w:w="120" w:type="dxa"/>
-            </w:tcMar>
-          </w:tcPr>
-          <w:p>
-            <w:pPr>
-              <w:jc w:val="center"/>
-            </w:pPr>
-            <w:r>
-              <w:rPr>
-                <w:rFonts w:ascii="Calibri" w:hAnsi="Calibri"/>
-                <w:sz w:val="19"/>
-              </w:rPr>
-              <w:t>4482</w:t>
-            </w:r>
-          </w:p>
-        </w:tc>
-        <w:tc>
-          <w:tcPr>
-            <w:tcW w:type="dxa" w:w="1247"/>
-            <w:shd w:fill="F4F6F9"/>
-            <w:tcMar>
-              <w:top w:w="80" w:type="dxa"/>
-              <w:bottom w:w="80" w:type="dxa"/>
-              <w:left w:w="120" w:type="dxa"/>
-              <w:right w:w="120" w:type="dxa"/>
-            </w:tcMar>
-          </w:tcPr>
-          <w:p>
-            <w:pPr>
-              <w:jc w:val="center"/>
-            </w:pPr>
-            <w:r>
-              <w:rPr>
-                <w:rFonts w:ascii="Calibri" w:hAnsi="Calibri"/>
-                <w:sz w:val="19"/>
-              </w:rPr>
-              <w:t>25446</w:t>
-            </w:r>
-          </w:p>
-        </w:tc>
-        <w:tc>
-          <w:tcPr>
-            <w:tcW w:type="dxa" w:w="1247"/>
-            <w:shd w:fill="F4F6F9"/>
-            <w:tcMar>
-              <w:top w:w="80" w:type="dxa"/>
-              <w:bottom w:w="80" w:type="dxa"/>
-              <w:left w:w="120" w:type="dxa"/>
-              <w:right w:w="120" w:type="dxa"/>
-            </w:tcMar>
-          </w:tcPr>
-          <w:p>
-            <w:pPr>
-              <w:jc w:val="center"/>
-            </w:pPr>
-            <w:r>
-              <w:rPr>
-                <w:rFonts w:ascii="Calibri" w:hAnsi="Calibri"/>
-                <w:sz w:val="19"/>
-              </w:rPr>
-              <w:t>2654</w:t>
-            </w:r>
-          </w:p>
-        </w:tc>
-        <w:tc>
-          <w:tcPr>
-            <w:tcW w:type="dxa" w:w="1134"/>
-            <w:shd w:fill="F4F6F9"/>
-            <w:tcMar>
-              <w:top w:w="80" w:type="dxa"/>
-              <w:bottom w:w="80" w:type="dxa"/>
-              <w:left w:w="120" w:type="dxa"/>
-              <w:right w:w="120" w:type="dxa"/>
-            </w:tcMar>
-          </w:tcPr>
-          <w:p>
-            <w:pPr>
-              <w:jc w:val="center"/>
-            </w:pPr>
-            <w:r>
-              <w:rPr>
-                <w:rFonts w:ascii="Calibri" w:hAnsi="Calibri"/>
-                <w:sz w:val="19"/>
-              </w:rPr>
-              <w:t>37.2%</w:t>
-            </w:r>
-          </w:p>
-        </w:tc>
-        <w:tc>
-          <w:tcPr>
-            <w:tcW w:type="dxa" w:w="1417"/>
-            <w:shd w:fill="F4F6F9"/>
-            <w:tcMar>
-              <w:top w:w="80" w:type="dxa"/>
-              <w:bottom w:w="80" w:type="dxa"/>
-              <w:left w:w="120" w:type="dxa"/>
-              <w:right w:w="120" w:type="dxa"/>
-            </w:tcMar>
-          </w:tcPr>
-          <w:p>
-            <w:pPr>
-              <w:jc w:val="center"/>
-            </w:pPr>
-            <w:r>
-              <w:rPr>
-                <w:rFonts w:ascii="Calibri" w:hAnsi="Calibri"/>
-                <w:sz w:val="19"/>
-              </w:rPr>
-              <w:t>28.02</w:t>
             </w:r>
           </w:p>
         </w:tc>
@@ -1576,7 +1588,7 @@
         <w:tc>
           <w:tcPr>
             <w:tcW w:type="dxa" w:w="1984"/>
-            <w:shd w:fill="E8F7EE"/>
+            <w:shd w:fill="F4F6F9"/>
             <w:tcMar>
               <w:top w:w="80" w:type="dxa"/>
               <w:bottom w:w="80" w:type="dxa"/>
@@ -1591,18 +1603,16 @@
             <w:r>
               <w:rPr>
                 <w:rFonts w:ascii="Calibri" w:hAnsi="Calibri"/>
-                <w:b/>
-                <w:color w:val="2D9B6B"/>
                 <w:sz w:val="19"/>
               </w:rPr>
-              <w:t>DQN (ours) ★</w:t>
+              <w:t>Q-learning</w:t>
             </w:r>
           </w:p>
         </w:tc>
         <w:tc>
           <w:tcPr>
             <w:tcW w:type="dxa" w:w="1417"/>
-            <w:shd w:fill="E8F7EE"/>
+            <w:shd w:fill="F4F6F9"/>
             <w:tcMar>
               <w:top w:w="80" w:type="dxa"/>
               <w:bottom w:w="80" w:type="dxa"/>
@@ -1617,18 +1627,16 @@
             <w:r>
               <w:rPr>
                 <w:rFonts w:ascii="Calibri" w:hAnsi="Calibri"/>
-                <w:b/>
-                <w:color w:val="2D9B6B"/>
                 <w:sz w:val="19"/>
               </w:rPr>
-              <w:t>2957</w:t>
+              <w:t>4171</w:t>
             </w:r>
           </w:p>
         </w:tc>
         <w:tc>
           <w:tcPr>
             <w:tcW w:type="dxa" w:w="1247"/>
-            <w:shd w:fill="E8F7EE"/>
+            <w:shd w:fill="F4F6F9"/>
             <w:tcMar>
               <w:top w:w="80" w:type="dxa"/>
               <w:bottom w:w="80" w:type="dxa"/>
@@ -1643,18 +1651,16 @@
             <w:r>
               <w:rPr>
                 <w:rFonts w:ascii="Calibri" w:hAnsi="Calibri"/>
-                <w:b/>
-                <w:color w:val="2D9B6B"/>
                 <w:sz w:val="19"/>
               </w:rPr>
-              <w:t>39277</w:t>
+              <w:t>29595</w:t>
             </w:r>
           </w:p>
         </w:tc>
         <w:tc>
           <w:tcPr>
             <w:tcW w:type="dxa" w:w="1247"/>
-            <w:shd w:fill="E8F7EE"/>
+            <w:shd w:fill="F4F6F9"/>
             <w:tcMar>
               <w:top w:w="80" w:type="dxa"/>
               <w:bottom w:w="80" w:type="dxa"/>
@@ -1669,18 +1675,16 @@
             <w:r>
               <w:rPr>
                 <w:rFonts w:ascii="Calibri" w:hAnsi="Calibri"/>
-                <w:b/>
-                <w:color w:val="2D9B6B"/>
                 <w:sz w:val="19"/>
               </w:rPr>
-              <w:t>4487</w:t>
+              <w:t>2986</w:t>
             </w:r>
           </w:p>
         </w:tc>
         <w:tc>
           <w:tcPr>
             <w:tcW w:type="dxa" w:w="1134"/>
-            <w:shd w:fill="E8F7EE"/>
+            <w:shd w:fill="F4F6F9"/>
             <w:tcMar>
               <w:top w:w="80" w:type="dxa"/>
               <w:bottom w:w="80" w:type="dxa"/>
@@ -1695,18 +1699,16 @@
             <w:r>
               <w:rPr>
                 <w:rFonts w:ascii="Calibri" w:hAnsi="Calibri"/>
-                <w:b/>
-                <w:color w:val="2D9B6B"/>
                 <w:sz w:val="19"/>
               </w:rPr>
-              <w:t>31.7%</w:t>
+              <w:t>32.0%</w:t>
             </w:r>
           </w:p>
         </w:tc>
         <w:tc>
           <w:tcPr>
             <w:tcW w:type="dxa" w:w="1417"/>
-            <w:shd w:fill="E8F7EE"/>
+            <w:shd w:fill="F4F6F9"/>
             <w:tcMar>
               <w:top w:w="80" w:type="dxa"/>
               <w:bottom w:w="80" w:type="dxa"/>
@@ -1721,11 +1723,9 @@
             <w:r>
               <w:rPr>
                 <w:rFonts w:ascii="Calibri" w:hAnsi="Calibri"/>
-                <w:b/>
-                <w:color w:val="2D9B6B"/>
                 <w:sz w:val="19"/>
               </w:rPr>
-              <w:t>15.31</w:t>
+              <w:t>24.42</w:t>
             </w:r>
           </w:p>
         </w:tc>
@@ -2040,7 +2040,7 @@
                 <w:rFonts w:ascii="Calibri" w:hAnsi="Calibri"/>
                 <w:sz w:val="19"/>
               </w:rPr>
-              <w:t>0.806</w:t>
+              <w:t>0.786</w:t>
             </w:r>
           </w:p>
         </w:tc>
@@ -2064,7 +2064,7 @@
                 <w:rFonts w:ascii="Calibri" w:hAnsi="Calibri"/>
                 <w:sz w:val="19"/>
               </w:rPr>
-              <w:t>1.041</w:t>
+              <w:t>0.748</w:t>
             </w:r>
           </w:p>
         </w:tc>
@@ -2088,7 +2088,7 @@
                 <w:rFonts w:ascii="Calibri" w:hAnsi="Calibri"/>
                 <w:sz w:val="19"/>
               </w:rPr>
-              <w:t>45%</w:t>
+              <w:t>28%</w:t>
             </w:r>
           </w:p>
         </w:tc>
@@ -2112,7 +2112,7 @@
                 <w:rFonts w:ascii="Calibri" w:hAnsi="Calibri"/>
                 <w:sz w:val="19"/>
               </w:rPr>
-              <w:t>0.2802</w:t>
+              <w:t>0.1372</w:t>
             </w:r>
           </w:p>
         </w:tc>
@@ -2136,7 +2136,7 @@
                 <w:rFonts w:ascii="Calibri" w:hAnsi="Calibri"/>
                 <w:sz w:val="19"/>
               </w:rPr>
-              <w:t>10.300</w:t>
+              <w:t>943666363355141.250</w:t>
             </w:r>
           </w:p>
         </w:tc>
@@ -2160,7 +2160,7 @@
                 <w:rFonts w:ascii="Calibri" w:hAnsi="Calibri"/>
                 <w:sz w:val="19"/>
               </w:rPr>
-              <w:t>50.91</w:t>
+              <w:t>53.90</w:t>
             </w:r>
           </w:p>
         </w:tc>
@@ -2210,7 +2210,7 @@
                 <w:rFonts w:ascii="Calibri" w:hAnsi="Calibri"/>
                 <w:sz w:val="19"/>
               </w:rPr>
-              <w:t>0.898</w:t>
+              <w:t>1.129</w:t>
             </w:r>
           </w:p>
         </w:tc>
@@ -2234,7 +2234,7 @@
                 <w:rFonts w:ascii="Calibri" w:hAnsi="Calibri"/>
                 <w:sz w:val="19"/>
               </w:rPr>
-              <w:t>1.099</w:t>
+              <w:t>1.048</w:t>
             </w:r>
           </w:p>
         </w:tc>
@@ -2258,7 +2258,7 @@
                 <w:rFonts w:ascii="Calibri" w:hAnsi="Calibri"/>
                 <w:sz w:val="19"/>
               </w:rPr>
-              <w:t>53%</w:t>
+              <w:t>23%</w:t>
             </w:r>
           </w:p>
         </w:tc>
@@ -2282,7 +2282,7 @@
                 <w:rFonts w:ascii="Calibri" w:hAnsi="Calibri"/>
                 <w:sz w:val="19"/>
               </w:rPr>
-              <w:t>0.6968</w:t>
+              <w:t>0.7568</w:t>
             </w:r>
           </w:p>
         </w:tc>
@@ -2306,7 +2306,7 @@
                 <w:rFonts w:ascii="Calibri" w:hAnsi="Calibri"/>
                 <w:sz w:val="19"/>
               </w:rPr>
-              <w:t>8.833</w:t>
+              <w:t>2.365</w:t>
             </w:r>
           </w:p>
         </w:tc>
@@ -2330,7 +2330,7 @@
                 <w:rFonts w:ascii="Calibri" w:hAnsi="Calibri"/>
                 <w:sz w:val="19"/>
               </w:rPr>
-              <w:t>2.74</w:t>
+              <w:t>3.29</w:t>
             </w:r>
           </w:p>
         </w:tc>
@@ -2380,7 +2380,7 @@
                 <w:rFonts w:ascii="Calibri" w:hAnsi="Calibri"/>
                 <w:sz w:val="19"/>
               </w:rPr>
-              <w:t>0.074</w:t>
+              <w:t>0.016</w:t>
             </w:r>
           </w:p>
         </w:tc>
@@ -2404,7 +2404,7 @@
                 <w:rFonts w:ascii="Calibri" w:hAnsi="Calibri"/>
                 <w:sz w:val="19"/>
               </w:rPr>
-              <w:t>0.192</w:t>
+              <w:t>0.015</w:t>
             </w:r>
           </w:p>
         </w:tc>
@@ -2428,7 +2428,7 @@
                 <w:rFonts w:ascii="Calibri" w:hAnsi="Calibri"/>
                 <w:sz w:val="19"/>
               </w:rPr>
-              <w:t>33%</w:t>
+              <w:t>20%</w:t>
             </w:r>
           </w:p>
         </w:tc>
@@ -2452,7 +2452,7 @@
                 <w:rFonts w:ascii="Calibri" w:hAnsi="Calibri"/>
                 <w:sz w:val="19"/>
               </w:rPr>
-              <w:t>0.1532</w:t>
+              <w:t>0.8910</w:t>
             </w:r>
           </w:p>
         </w:tc>
@@ -2476,7 +2476,7 @@
                 <w:rFonts w:ascii="Calibri" w:hAnsi="Calibri"/>
                 <w:sz w:val="19"/>
               </w:rPr>
-              <w:t>8.762</w:t>
+              <w:t>8.605</w:t>
             </w:r>
           </w:p>
         </w:tc>
@@ -2500,7 +2500,7 @@
                 <w:rFonts w:ascii="Calibri" w:hAnsi="Calibri"/>
                 <w:sz w:val="19"/>
               </w:rPr>
-              <w:t>4.75</w:t>
+              <w:t>5.26</w:t>
             </w:r>
           </w:p>
         </w:tc>
@@ -2550,7 +2550,7 @@
                 <w:rFonts w:ascii="Calibri" w:hAnsi="Calibri"/>
                 <w:sz w:val="19"/>
               </w:rPr>
-              <w:t>0.041</w:t>
+              <w:t>0.102</w:t>
             </w:r>
           </w:p>
         </w:tc>
@@ -2574,7 +2574,7 @@
                 <w:rFonts w:ascii="Calibri" w:hAnsi="Calibri"/>
                 <w:sz w:val="19"/>
               </w:rPr>
-              <w:t>0.174</w:t>
+              <w:t>0.117</w:t>
             </w:r>
           </w:p>
         </w:tc>
@@ -2598,7 +2598,7 @@
                 <w:rFonts w:ascii="Calibri" w:hAnsi="Calibri"/>
                 <w:sz w:val="19"/>
               </w:rPr>
-              <w:t>33%</w:t>
+              <w:t>20%</w:t>
             </w:r>
           </w:p>
         </w:tc>
@@ -2646,7 +2646,7 @@
                 <w:rFonts w:ascii="Calibri" w:hAnsi="Calibri"/>
                 <w:sz w:val="19"/>
               </w:rPr>
-              <w:t>4.673</w:t>
+              <w:t>2.954</w:t>
             </w:r>
           </w:p>
         </w:tc>
@@ -2670,7 +2670,7 @@
                 <w:rFonts w:ascii="Calibri" w:hAnsi="Calibri"/>
                 <w:sz w:val="19"/>
               </w:rPr>
-              <w:t>0.15</w:t>
+              <w:t>0.16</w:t>
             </w:r>
           </w:p>
         </w:tc>
@@ -2884,7 +2884,7 @@
           <w:color w:val="222222"/>
           <w:sz w:val="21"/>
         </w:rPr>
-        <w:t>We did not use PyTorch or TensorFlow. The 3-layer neural network, backpropagation, Adam optimizer, Double DQN logic, and Prioritized Experience Replay SumTree are all hand-implemented. This demonstrates deep understanding of the underlying mathematics, not just API calls.</w:t>
+        <w:t>We did not use PyTorch or TensorFlow. The dueling neural network, backpropagation, Adam optimizer, Double DQN logic, and Prioritized Experience Replay SumTree are all hand-implemented. This demonstrates deep understanding of the underlying mathematics, not just API calls.</w:t>
       </w:r>
     </w:p>
     <w:p>
@@ -3407,7 +3407,7 @@
                 <w:rFonts w:ascii="Calibri" w:hAnsi="Calibri"/>
                 <w:sz w:val="19"/>
               </w:rPr>
-              <w:t>3-layer MLP Q-network in pure NumPy</w:t>
+              <w:t>Dueling Q-network (value + advantage streams) in pure NumPy</w:t>
             </w:r>
           </w:p>
         </w:tc>

</xml_diff>